<commit_message>
Huacho OCI: no anexar la carta al Alcalde; anexos mínimos
Co-Authored-By: Claude Opus 5.5 <noreply@anthropic.com>
Claude-Session: https://claude.ai/code/session_01Ls5dNjYBLNjXxuGTDk7v3H
</commit_message>
<xml_diff>
--- a/carta-reclamo/huacho/Carta_Huacho_2_OCI.docx
+++ b/carta-reclamo/huacho/Carta_Huacho_2_OCI.docx
@@ -695,7 +695,7 @@
         <w:t xml:space="preserve"> </w:t>
       </w:r>
       <w:r>
-        <w:t xml:space="preserve">Con fecha [__] de octubre de 2026 le hemos cursado un</w:t>
+        <w:t xml:space="preserve">Con fecha [__] de octubre de 2026 le hemos cursado al Alcalde un</w:t>
       </w:r>
       <w:r>
         <w:t xml:space="preserve"> </w:t>
@@ -711,7 +711,20 @@
         <w:t xml:space="preserve"> </w:t>
       </w:r>
       <w:r>
-        <w:t xml:space="preserve">(Anexo 1).</w:t>
+        <w:t xml:space="preserve">(Carta N.° [___]-2026-ABS BIENES &amp; SERVICIOS E.I.R.L.),</w:t>
+      </w:r>
+      <w:r>
+        <w:t xml:space="preserve"> </w:t>
+      </w:r>
+      <w:r>
+        <w:rPr>
+          <w:bCs/>
+          <w:b/>
+        </w:rPr>
+        <w:t xml:space="preserve">con copia a su despacho</w:t>
+      </w:r>
+      <w:r>
+        <w:t xml:space="preserve">, por lo que no la adjuntamos nuevamente.</w:t>
       </w:r>
     </w:p>
     <w:bookmarkEnd w:id="20"/>
@@ -1214,7 +1227,7 @@
       </w:r>
     </w:p>
     <w:bookmarkEnd w:id="21"/>
-    <w:bookmarkStart w:id="22" w:name="lo-que-solicitamos"/>
+    <w:bookmarkStart w:id="31" w:name="lo-que-solicitamos"/>
     <w:p>
       <w:pPr>
         <w:pStyle w:val="Heading2"/>
@@ -1504,7 +1517,7 @@
         <w:t xml:space="preserve"> </w:t>
       </w:r>
       <w:r>
-        <w:t xml:space="preserve">Carta N.° [___]-2026-ABS BIENES &amp; SERVICIOS E.I.R.L. dirigida al Alcalde de la Municipalidad Provincial de Huaura – Huacho, con todos sus anexos (orden de compra, guía de remisión con sello de recepción, factura, consulta SIAF, expediente interno, cartas anteriores y oficios de PERÚ COMPRAS).</w:t>
+        <w:t xml:space="preserve">Consulta del Expediente SIAF N.° 3619-2022 (giro de S/ 3,482.27 y rebaja de S/ 1,741.12).</w:t>
       </w:r>
     </w:p>
     <w:p>
@@ -1526,10 +1539,214 @@
         <w:t xml:space="preserve"> </w:t>
       </w:r>
       <w:r>
-        <w:t xml:space="preserve">Oficios N.° 001886-2024-PERÚ COMPRAS-DAM y N.° 003413-2026-PERÚ COMPRAS-DCEME.</w:t>
-      </w:r>
-    </w:p>
-    <w:bookmarkEnd w:id="22"/>
+        <w:t xml:space="preserve">Oficio N.° 003413-2026-PERÚ COMPRAS-DCEME, del 21 de julio de 2026.</w:t>
+      </w:r>
+    </w:p>
+    <w:p>
+      <w:pPr>
+        <w:pStyle w:val="FirstParagraph"/>
+      </w:pPr>
+      <w:r>
+        <w:rPr>
+          <w:iCs/>
+          <w:i/>
+        </w:rPr>
+        <w:t xml:space="preserve">Los demás antecedentes (orden de compra, guía de remisión, factura y oficios de PERÚ COMPRAS de 2024) obran en la carta dirigida al Alcalde, remitida en copia a su despacho.</w:t>
+      </w:r>
+    </w:p>
+    <w:p>
+      <w:r>
+        <w:br w:type="page"/>
+      </w:r>
+    </w:p>
+    <w:p>
+      <w:pPr>
+        <w:pStyle w:val="BodyText"/>
+      </w:pPr>
+      <w:r>
+        <w:drawing>
+          <wp:inline>
+            <wp:extent cx="5334000" cy="7532076"/>
+            <wp:effectExtent b="0" l="0" r="0" t="0"/>
+            <wp:docPr descr="" title="" id="23" name="Picture"/>
+            <a:graphic>
+              <a:graphicData uri="http://schemas.openxmlformats.org/drawingml/2006/picture">
+                <pic:pic>
+                  <pic:nvPicPr>
+                    <pic:cNvPr descr="../anexos_huacho/p8.png" id="24" name="Picture"/>
+                    <pic:cNvPicPr>
+                      <a:picLocks noChangeArrowheads="1" noChangeAspect="1"/>
+                    </pic:cNvPicPr>
+                  </pic:nvPicPr>
+                  <pic:blipFill>
+                    <a:blip r:embed="rId22"/>
+                    <a:stretch>
+                      <a:fillRect/>
+                    </a:stretch>
+                  </pic:blipFill>
+                  <pic:spPr bwMode="auto">
+                    <a:xfrm>
+                      <a:off x="0" y="0"/>
+                      <a:ext cx="5334000" cy="7532076"/>
+                    </a:xfrm>
+                    <a:prstGeom prst="rect">
+                      <a:avLst/>
+                    </a:prstGeom>
+                    <a:noFill/>
+                    <a:ln w="9525">
+                      <a:noFill/>
+                      <a:headEnd/>
+                      <a:tailEnd/>
+                    </a:ln>
+                  </pic:spPr>
+                </pic:pic>
+              </a:graphicData>
+            </a:graphic>
+          </wp:inline>
+        </w:drawing>
+      </w:r>
+    </w:p>
+    <w:p>
+      <w:pPr>
+        <w:pStyle w:val="BodyText"/>
+      </w:pPr>
+      <w:r>
+        <w:rPr>
+          <w:bCs/>
+          <w:b/>
+        </w:rPr>
+        <w:t xml:space="preserve">Anexo 1 – Consulta del Expediente SIAF N.° 3619-2022: giro de S/ 3,482.27 del 26/01/2023 y rebaja de S/ 1,741.12.</w:t>
+      </w:r>
+    </w:p>
+    <w:p>
+      <w:r>
+        <w:br w:type="page"/>
+      </w:r>
+    </w:p>
+    <w:p>
+      <w:pPr>
+        <w:pStyle w:val="BodyText"/>
+      </w:pPr>
+      <w:r>
+        <w:drawing>
+          <wp:inline>
+            <wp:extent cx="4679999" cy="6618857"/>
+            <wp:effectExtent b="0" l="0" r="0" t="0"/>
+            <wp:docPr descr="" title="" id="26" name="Picture"/>
+            <a:graphic>
+              <a:graphicData uri="http://schemas.openxmlformats.org/drawingml/2006/picture">
+                <pic:pic>
+                  <pic:nvPicPr>
+                    <pic:cNvPr descr="../anexos_huacho/ag2.png" id="27" name="Picture"/>
+                    <pic:cNvPicPr>
+                      <a:picLocks noChangeArrowheads="1" noChangeAspect="1"/>
+                    </pic:cNvPicPr>
+                  </pic:nvPicPr>
+                  <pic:blipFill>
+                    <a:blip r:embed="rId25"/>
+                    <a:stretch>
+                      <a:fillRect/>
+                    </a:stretch>
+                  </pic:blipFill>
+                  <pic:spPr bwMode="auto">
+                    <a:xfrm>
+                      <a:off x="0" y="0"/>
+                      <a:ext cx="4679999" cy="6618857"/>
+                    </a:xfrm>
+                    <a:prstGeom prst="rect">
+                      <a:avLst/>
+                    </a:prstGeom>
+                    <a:noFill/>
+                    <a:ln w="9525">
+                      <a:noFill/>
+                      <a:headEnd/>
+                      <a:tailEnd/>
+                    </a:ln>
+                  </pic:spPr>
+                </pic:pic>
+              </a:graphicData>
+            </a:graphic>
+          </wp:inline>
+        </w:drawing>
+      </w:r>
+    </w:p>
+    <w:p>
+      <w:pPr>
+        <w:pStyle w:val="BodyText"/>
+      </w:pPr>
+      <w:r>
+        <w:rPr>
+          <w:bCs/>
+          <w:b/>
+        </w:rPr>
+        <w:t xml:space="preserve">Anexo 2 – Oficio N.° 003413-2026-PERÚ COMPRAS-DCEME, del 21/07/2026 (pág. 1).</w:t>
+      </w:r>
+    </w:p>
+    <w:p>
+      <w:r>
+        <w:br w:type="page"/>
+      </w:r>
+    </w:p>
+    <w:p>
+      <w:pPr>
+        <w:pStyle w:val="BodyText"/>
+      </w:pPr>
+      <w:r>
+        <w:drawing>
+          <wp:inline>
+            <wp:extent cx="4679999" cy="6618857"/>
+            <wp:effectExtent b="0" l="0" r="0" t="0"/>
+            <wp:docPr descr="" title="" id="29" name="Picture"/>
+            <a:graphic>
+              <a:graphicData uri="http://schemas.openxmlformats.org/drawingml/2006/picture">
+                <pic:pic>
+                  <pic:nvPicPr>
+                    <pic:cNvPr descr="../anexos_huacho/ag3.png" id="30" name="Picture"/>
+                    <pic:cNvPicPr>
+                      <a:picLocks noChangeArrowheads="1" noChangeAspect="1"/>
+                    </pic:cNvPicPr>
+                  </pic:nvPicPr>
+                  <pic:blipFill>
+                    <a:blip r:embed="rId28"/>
+                    <a:stretch>
+                      <a:fillRect/>
+                    </a:stretch>
+                  </pic:blipFill>
+                  <pic:spPr bwMode="auto">
+                    <a:xfrm>
+                      <a:off x="0" y="0"/>
+                      <a:ext cx="4679999" cy="6618857"/>
+                    </a:xfrm>
+                    <a:prstGeom prst="rect">
+                      <a:avLst/>
+                    </a:prstGeom>
+                    <a:noFill/>
+                    <a:ln w="9525">
+                      <a:noFill/>
+                      <a:headEnd/>
+                      <a:tailEnd/>
+                    </a:ln>
+                  </pic:spPr>
+                </pic:pic>
+              </a:graphicData>
+            </a:graphic>
+          </wp:inline>
+        </w:drawing>
+      </w:r>
+    </w:p>
+    <w:p>
+      <w:pPr>
+        <w:pStyle w:val="BodyText"/>
+      </w:pPr>
+      <w:r>
+        <w:rPr>
+          <w:bCs/>
+          <w:b/>
+        </w:rPr>
+        <w:t xml:space="preserve">Anexo 2 (cont.) – PERÚ COMPRAS corrobora el incumplimiento de la Municipalidad y lo traslada al OCI.</w:t>
+      </w:r>
+    </w:p>
+    <w:bookmarkEnd w:id="31"/>
     <w:sectPr/>
   </w:body>
 </w:document>

</xml_diff>

<commit_message>
Huacho: usar carta al Alcalde 07102026-1, nueva numeración y foliado simple continuo
Co-Authored-By: Claude Opus 5.5 <noreply@anthropic.com>
Claude-Session: https://claude.ai/code/session_01Ls5dNjYBLNjXxuGTDk7v3H
</commit_message>
<xml_diff>
--- a/carta-reclamo/huacho/Carta_Huacho_2_OCI.docx
+++ b/carta-reclamo/huacho/Carta_Huacho_2_OCI.docx
@@ -19,7 +19,7 @@
           <w:bCs/>
           <w:b/>
         </w:rPr>
-        <w:t xml:space="preserve">CARTA N.° 358-2026-ABS BIENES &amp; SERVICIOS E.I.R.L.</w:t>
+        <w:t xml:space="preserve">CARTA N.° 07102026-2-ABS BIENES &amp; SERVICIOS E.I.R.L.</w:t>
       </w:r>
     </w:p>
     <w:p>
@@ -711,7 +711,7 @@
         <w:t xml:space="preserve"> </w:t>
       </w:r>
       <w:r>
-        <w:t xml:space="preserve">(Carta N.° 357-2026-ABS BIENES &amp; SERVICIOS E.I.R.L.),</w:t>
+        <w:t xml:space="preserve">(Carta N.° 07102026-1-ABS BIENES &amp; SERVICIOS E.I.R.L.),</w:t>
       </w:r>
       <w:r>
         <w:t xml:space="preserve"> </w:t>

</xml_diff>

<commit_message>
Huacho OCI: correcciones de redacción, anexos y foliado
Co-Authored-By: Claude Opus 5.5 <noreply@anthropic.com>
Claude-Session: https://claude.ai/code/session_01Ls5dNjYBLNjXxuGTDk7v3H
</commit_message>
<xml_diff>
--- a/carta-reclamo/huacho/Carta_Huacho_2_OCI.docx
+++ b/carta-reclamo/huacho/Carta_Huacho_2_OCI.docx
@@ -71,6 +71,7 @@
     <w:p>
       <w:pPr>
         <w:pStyle w:val="BodyText"/>
+        <w:jc w:val="both"/>
       </w:pPr>
       <w:r>
         <w:rPr>
@@ -150,6 +151,7 @@
           <w:numId w:val="1001"/>
         </w:numPr>
         <w:pStyle w:val="Compact"/>
+        <w:jc w:val="both"/>
       </w:pPr>
       <w:r>
         <w:t xml:space="preserve">Oficio N.° 001886-2024-PERÚ COMPRAS-DAM, del 14 de febrero de 2024, dirigido a su despacho.</w:t>
@@ -162,6 +164,7 @@
           <w:numId w:val="1001"/>
         </w:numPr>
         <w:pStyle w:val="Compact"/>
+        <w:jc w:val="both"/>
       </w:pPr>
       <w:r>
         <w:t xml:space="preserve">Oficio N.° 003413-2026-PERÚ COMPRAS-DCEME, del 21 de julio de 2026, dirigido a su despacho.</w:t>
@@ -174,6 +177,7 @@
           <w:numId w:val="1001"/>
         </w:numPr>
         <w:pStyle w:val="Compact"/>
+        <w:jc w:val="both"/>
       </w:pPr>
       <w:r>
         <w:t xml:space="preserve">Nuestras cartas a la Municipalidad del 13/03/2025, 28/04/2025, 02/07/2026 y 03/08/2026, todas con copia a su despacho.</w:t>
@@ -197,6 +201,7 @@
     <w:p>
       <w:pPr>
         <w:pStyle w:val="BodyText"/>
+        <w:jc w:val="both"/>
       </w:pPr>
       <w:r>
         <w:rPr>
@@ -245,7 +250,7 @@
         <w:t xml:space="preserve">48054321</w:t>
       </w:r>
       <w:r>
-        <w:t xml:space="preserve">, se dirige a ustedes a su despacho para</w:t>
+        <w:t xml:space="preserve">, se dirige a su despacho para</w:t>
       </w:r>
       <w:r>
         <w:t xml:space="preserve"> </w:t>
@@ -292,6 +297,7 @@
     <w:p>
       <w:pPr>
         <w:pStyle w:val="FirstParagraph"/>
+        <w:jc w:val="both"/>
       </w:pPr>
       <w:r>
         <w:rPr>
@@ -368,6 +374,7 @@
     <w:p>
       <w:pPr>
         <w:pStyle w:val="BodyText"/>
+        <w:jc w:val="both"/>
       </w:pPr>
       <w:r>
         <w:rPr>
@@ -444,6 +451,7 @@
           <w:numId w:val="1002"/>
         </w:numPr>
         <w:pStyle w:val="Compact"/>
+        <w:jc w:val="both"/>
       </w:pPr>
       <w:r>
         <w:t xml:space="preserve">Se registró un</w:t>
@@ -485,6 +493,7 @@
           <w:numId w:val="1002"/>
         </w:numPr>
         <w:pStyle w:val="Compact"/>
+        <w:jc w:val="both"/>
       </w:pPr>
       <w:r>
         <w:t xml:space="preserve">Se</w:t>
@@ -522,6 +531,7 @@
     <w:p>
       <w:pPr>
         <w:pStyle w:val="FirstParagraph"/>
+        <w:jc w:val="both"/>
       </w:pPr>
       <w:r>
         <w:rPr>
@@ -553,6 +563,7 @@
     <w:p>
       <w:pPr>
         <w:pStyle w:val="BodyText"/>
+        <w:jc w:val="both"/>
       </w:pPr>
       <w:r>
         <w:rPr>
@@ -651,6 +662,7 @@
     <w:p>
       <w:pPr>
         <w:pStyle w:val="BodyText"/>
+        <w:jc w:val="both"/>
       </w:pPr>
       <w:r>
         <w:rPr>
@@ -695,7 +707,7 @@
         <w:t xml:space="preserve"> </w:t>
       </w:r>
       <w:r>
-        <w:t xml:space="preserve">Con fecha 07 de octubre de 2026 le hemos cursado al Alcalde un</w:t>
+        <w:t xml:space="preserve">Con fecha 07 de octubre de 2026 le hemos cursado un</w:t>
       </w:r>
       <w:r>
         <w:t xml:space="preserve"> </w:t>
@@ -711,20 +723,7 @@
         <w:t xml:space="preserve"> </w:t>
       </w:r>
       <w:r>
-        <w:t xml:space="preserve">(Carta N.° 07102026-1-ABS BIENES &amp; SERVICIOS E.I.R.L.),</w:t>
-      </w:r>
-      <w:r>
-        <w:t xml:space="preserve"> </w:t>
-      </w:r>
-      <w:r>
-        <w:rPr>
-          <w:bCs/>
-          <w:b/>
-        </w:rPr>
-        <w:t xml:space="preserve">con copia a su despacho</w:t>
-      </w:r>
-      <w:r>
-        <w:t xml:space="preserve">, por lo que no la adjuntamos nuevamente.</w:t>
+        <w:t xml:space="preserve">(Carta N.° 07102026-1).</w:t>
       </w:r>
     </w:p>
     <w:bookmarkEnd w:id="20"/>
@@ -740,6 +739,7 @@
     <w:p>
       <w:pPr>
         <w:pStyle w:val="FirstParagraph"/>
+        <w:jc w:val="both"/>
       </w:pPr>
       <w:r>
         <w:rPr>
@@ -824,6 +824,7 @@
     <w:p>
       <w:pPr>
         <w:pStyle w:val="BodyText"/>
+        <w:jc w:val="both"/>
       </w:pPr>
       <w:r>
         <w:rPr>
@@ -846,6 +847,7 @@
           <w:numId w:val="1003"/>
         </w:numPr>
         <w:pStyle w:val="Compact"/>
+        <w:jc w:val="both"/>
       </w:pPr>
       <w:r>
         <w:t xml:space="preserve">un</w:t>
@@ -981,6 +983,7 @@
           <w:numId w:val="1004"/>
         </w:numPr>
         <w:pStyle w:val="Compact"/>
+        <w:jc w:val="both"/>
       </w:pPr>
       <w:r>
         <w:rPr>
@@ -1057,6 +1060,7 @@
           <w:numId w:val="1004"/>
         </w:numPr>
         <w:pStyle w:val="Compact"/>
+        <w:jc w:val="both"/>
       </w:pPr>
       <w:r>
         <w:rPr>
@@ -1079,6 +1083,7 @@
           <w:numId w:val="1004"/>
         </w:numPr>
         <w:pStyle w:val="Compact"/>
+        <w:jc w:val="both"/>
       </w:pPr>
       <w:r>
         <w:rPr>
@@ -1156,6 +1161,7 @@
     <w:p>
       <w:pPr>
         <w:pStyle w:val="FirstParagraph"/>
+        <w:jc w:val="both"/>
       </w:pPr>
       <w:r>
         <w:rPr>
@@ -1243,6 +1249,7 @@
           <w:numId w:val="1005"/>
         </w:numPr>
         <w:pStyle w:val="Compact"/>
+        <w:jc w:val="both"/>
       </w:pPr>
       <w:r>
         <w:t xml:space="preserve">Que su despacho</w:t>
@@ -1271,6 +1278,7 @@
           <w:numId w:val="1005"/>
         </w:numPr>
         <w:pStyle w:val="Compact"/>
+        <w:jc w:val="both"/>
       </w:pPr>
       <w:r>
         <w:t xml:space="preserve">Que se</w:t>
@@ -1327,6 +1335,7 @@
           <w:numId w:val="1005"/>
         </w:numPr>
         <w:pStyle w:val="Compact"/>
+        <w:jc w:val="both"/>
       </w:pPr>
       <w:r>
         <w:t xml:space="preserve">Que se</w:t>
@@ -1355,6 +1364,7 @@
           <w:numId w:val="1005"/>
         </w:numPr>
         <w:pStyle w:val="Compact"/>
+        <w:jc w:val="both"/>
       </w:pPr>
       <w:r>
         <w:t xml:space="preserve">Que se</w:t>
@@ -1383,6 +1393,7 @@
           <w:numId w:val="1005"/>
         </w:numPr>
         <w:pStyle w:val="Compact"/>
+        <w:jc w:val="both"/>
       </w:pPr>
       <w:r>
         <w:t xml:space="preserve">Que se nos</w:t>
@@ -1530,6 +1541,7 @@
           <w:numId w:val="1006"/>
         </w:numPr>
         <w:pStyle w:val="Compact"/>
+        <w:jc w:val="both"/>
       </w:pPr>
       <w:r>
         <w:rPr>
@@ -1570,6 +1582,7 @@
     <w:p>
       <w:pPr>
         <w:pStyle w:val="FirstParagraph"/>
+        <w:jc w:val="both"/>
       </w:pPr>
       <w:r>
         <w:rPr>
@@ -1634,6 +1647,7 @@
     <w:p>
       <w:pPr>
         <w:pStyle w:val="BodyText"/>
+        <w:jc w:val="both"/>
       </w:pPr>
       <w:r>
         <w:rPr>
@@ -1762,6 +1776,7 @@
     <w:p>
       <w:pPr>
         <w:pStyle w:val="BodyText"/>
+        <w:jc w:val="both"/>
       </w:pPr>
       <w:r>
         <w:rPr>

</xml_diff>

<commit_message>
Huacho: corregir N.° de expediente SIAF (3618) y usar captura legible en carta al OCI
Co-Authored-By: Claude Opus 5.5 <noreply@anthropic.com>
Claude-Session: https://claude.ai/code/session_01Ls5dNjYBLNjXxuGTDk7v3H
</commit_message>
<xml_diff>
--- a/carta-reclamo/huacho/Carta_Huacho_2_OCI.docx
+++ b/carta-reclamo/huacho/Carta_Huacho_2_OCI.docx
@@ -435,7 +435,7 @@
           <w:bCs/>
           <w:b/>
         </w:rPr>
-        <w:t xml:space="preserve">Expediente SIAF N.° 3619-2022</w:t>
+        <w:t xml:space="preserve">Expediente SIAF N.° 3618-2022</w:t>
       </w:r>
       <w:r>
         <w:t xml:space="preserve"> </w:t>
@@ -1268,7 +1268,7 @@
         <w:t xml:space="preserve"> </w:t>
       </w:r>
       <w:r>
-        <w:t xml:space="preserve">respecto de la Orden de Compra OCAM-2022-301371-25-0 / 25-1 y del Expediente SIAF N.° 3619-2022.</w:t>
+        <w:t xml:space="preserve">respecto de la Orden de Compra OCAM-2022-301371-25-0 / 25-1 y del Expediente SIAF N.° 3618-2022.</w:t>
       </w:r>
     </w:p>
     <w:p>
@@ -1554,7 +1554,7 @@
         <w:t xml:space="preserve"> </w:t>
       </w:r>
       <w:r>
-        <w:t xml:space="preserve">Consulta del Expediente SIAF N.° 3619-2022 (giro de S/ 3,482.27 y rebaja de S/ 1,741.12).</w:t>
+        <w:t xml:space="preserve">Consulta del Expediente SIAF N.° 3618-2022 (giro de S/ 3,482.27 y rebaja de S/ 1,741.12).</w:t>
       </w:r>
     </w:p>
     <w:p>
@@ -1604,14 +1604,14 @@
       <w:r>
         <w:drawing>
           <wp:inline>
-            <wp:extent cx="5334000" cy="7532076"/>
+            <wp:extent cx="5334000" cy="4982380"/>
             <wp:effectExtent b="0" l="0" r="0" t="0"/>
             <wp:docPr descr="" title="" id="26" name="Picture"/>
             <a:graphic>
               <a:graphicData uri="http://schemas.openxmlformats.org/drawingml/2006/picture">
                 <pic:pic>
                   <pic:nvPicPr>
-                    <pic:cNvPr descr="../anexos_huacho/p8.png" id="27" name="Picture"/>
+                    <pic:cNvPr descr="../anexos_huacho/siaf_3618_claro.png" id="27" name="Picture"/>
                     <pic:cNvPicPr>
                       <a:picLocks noChangeArrowheads="1" noChangeAspect="1"/>
                     </pic:cNvPicPr>
@@ -1625,7 +1625,7 @@
                   <pic:spPr bwMode="auto">
                     <a:xfrm>
                       <a:off x="0" y="0"/>
-                      <a:ext cx="5334000" cy="7532076"/>
+                      <a:ext cx="5334000" cy="4982380"/>
                     </a:xfrm>
                     <a:prstGeom prst="rect">
                       <a:avLst/>
@@ -1654,7 +1654,7 @@
           <w:bCs/>
           <w:b/>
         </w:rPr>
-        <w:t xml:space="preserve">Anexo 1 – Consulta del Expediente SIAF N.° 3619-2022: giro de S/ 3,482.27 del 26/01/2023 y rebaja de S/ 1,741.12.</w:t>
+        <w:t xml:space="preserve">Anexo 1 – Consulta del Expediente SIAF N.° 3618-2022: giro de S/ 3,482.27 del 26/01/2023 y rebaja de S/ 1,741.12.</w:t>
       </w:r>
     </w:p>
     <w:p>

</xml_diff>